<commit_message>
added offline mode and UI
</commit_message>
<xml_diff>
--- a/eval/fixtures/docs/sam_rivera_resume.docx
+++ b/eval/fixtures/docs/sam_rivera_resume.docx
@@ -40,7 +40,7 @@
     </w:p>
     <w:p>
       <w:r>
-        <w:t>Machine learning engineer focused on retrieval systems and search relevance. Built the Atlas semantic search platform serving 12M queries per month.</w:t>
+        <w:t>Machine learning engineer focused on retrieval systems and search relevance. Cares more about whether the right document is found than about which model found it.</w:t>
       </w:r>
     </w:p>
     <w:p>
@@ -50,7 +50,12 @@
     </w:p>
     <w:p>
       <w:r>
-        <w:t>ML Engineer | Initech Labs | Jan 2022 - Present. Owned the Atlas ranking model and the embedding refresh pipeline.</w:t>
+        <w:t>ML Engineer | Acme Robotics | Feb 2025 - Present. Leads the Atlas project, semantic search over Acme's internal documentation and robot logs.</w:t>
+      </w:r>
+    </w:p>
+    <w:p>
+      <w:r>
+        <w:t>Search Engineer | Initech Labs | Jan 2021 - Jan 2025. Owned the ranking model and the embedding refresh pipeline for a product search engine serving 12M queries per month.</w:t>
       </w:r>
     </w:p>
     <w:sectPr>

</xml_diff>